<commit_message>
Relatório corrigido e versão em PDF
Co-Authored-By: Claude Opus 5.5 <noreply@anthropic.com>
Claude-Session: https://claude.ai/code/session_01Gbozfu7ox939wQaGXgCkk1
</commit_message>
<xml_diff>
--- a/relatorio/RELATORIO_VP2.docx
+++ b/relatorio/RELATORIO_VP2.docx
@@ -2,7 +2,7 @@
 <file path=word/document.xml><?xml version="1.0" encoding="utf-8"?>
 <w:document xmlns:w="http://schemas.openxmlformats.org/wordprocessingml/2006/main" xmlns:m="http://schemas.openxmlformats.org/officeDocument/2006/math" xmlns:r="http://schemas.openxmlformats.org/officeDocument/2006/relationships" xmlns:o="urn:schemas-microsoft-com:office:office" xmlns:v="urn:schemas-microsoft-com:vml" xmlns:w10="urn:schemas-microsoft-com:office:word" xmlns:a="http://schemas.openxmlformats.org/drawingml/2006/main" xmlns:pic="http://schemas.openxmlformats.org/drawingml/2006/picture" xmlns:wp="http://schemas.openxmlformats.org/drawingml/2006/wordprocessingDrawing">
   <w:body>
-    <w:bookmarkStart w:id="145" w:name="Xb4ad2a34c758a341b0e167bbb9cc1244bbcd491"/>
+    <w:bookmarkStart w:id="148" w:name="Xb4ad2a34c758a341b0e167bbb9cc1244bbcd491"/>
     <w:p>
       <w:pPr>
         <w:pStyle w:val="Heading1"/>
@@ -429,7 +429,7 @@
       </w:tr>
     </w:tbl>
     <w:bookmarkEnd w:id="20"/>
-    <w:bookmarkStart w:id="143" w:name="Xd67be1ee31d7297677487f2e41e7e0bde2149e8"/>
+    <w:bookmarkStart w:id="31" w:name="Xd67be1ee31d7297677487f2e41e7e0bde2149e8"/>
     <w:p>
       <w:pPr>
         <w:pStyle w:val="Heading2"/>
@@ -6502,15 +6502,19 @@
       <w:r>
         <w:t xml:space="preserve">: prever que o motor dura mais do que realmente dura (d &gt; 0, previsão atrasada) é punido mais fortemente, porque leva à falha em operação.</w:t>
       </w:r>
-      <w:r>
-        <w:t xml:space="preserve"> </w:t>
-      </w:r>
-      <w:r>
-        <w:t xml:space="preserve">## 3. Parte 1: CNN × modelos clássicos na inspeção visual de defeitos</w:t>
-      </w:r>
     </w:p>
     <w:bookmarkEnd w:id="30"/>
-    <w:bookmarkStart w:id="31" w:name="protocolo-comum-aos-dois-datasets"/>
+    <w:bookmarkEnd w:id="31"/>
+    <w:bookmarkStart w:id="101" w:name="X8182f8ea5feff807a67daf4ba149f69047948e4"/>
+    <w:p>
+      <w:pPr>
+        <w:pStyle w:val="Heading2"/>
+      </w:pPr>
+      <w:r>
+        <w:t xml:space="preserve">3. Parte 1: CNN × modelos clássicos na inspeção visual de defeitos</w:t>
+      </w:r>
+    </w:p>
+    <w:bookmarkStart w:id="32" w:name="protocolo-comum-aos-dois-datasets"/>
     <w:p>
       <w:pPr>
         <w:pStyle w:val="Heading3"/>
@@ -6691,8 +6695,8 @@
         </w:pict>
       </w:r>
     </w:p>
-    <w:bookmarkEnd w:id="31"/>
-    <w:bookmarkStart w:id="64" w:name="dataset-2-casting-product-defect"/>
+    <w:bookmarkEnd w:id="32"/>
+    <w:bookmarkStart w:id="65" w:name="dataset-2-casting-product-defect"/>
     <w:p>
       <w:pPr>
         <w:pStyle w:val="Heading3"/>
@@ -6701,7 +6705,7 @@
         <w:t xml:space="preserve">3.2 Dataset 2: Casting Product Defect</w:t>
       </w:r>
     </w:p>
-    <w:bookmarkStart w:id="41" w:name="análise-exploratória"/>
+    <w:bookmarkStart w:id="42" w:name="análise-exploratória"/>
     <w:p>
       <w:pPr>
         <w:pStyle w:val="Heading4"/>
@@ -6968,18 +6972,18 @@
           <wp:inline>
             <wp:extent cx="5334000" cy="3965970"/>
             <wp:effectExtent b="0" l="0" r="0" t="0"/>
-            <wp:docPr descr="Distribuição" title="" id="33" name="Picture"/>
+            <wp:docPr descr="Distribuição" title="" id="34" name="Picture"/>
             <a:graphic>
               <a:graphicData uri="http://schemas.openxmlformats.org/drawingml/2006/picture">
                 <pic:pic>
                   <pic:nvPicPr>
-                    <pic:cNvPr descr="figuras/cast_dist.png" id="34" name="Picture"/>
+                    <pic:cNvPr descr="figuras/cast_dist.png" id="35" name="Picture"/>
                     <pic:cNvPicPr>
                       <a:picLocks noChangeArrowheads="1" noChangeAspect="1"/>
                     </pic:cNvPicPr>
                   </pic:nvPicPr>
                   <pic:blipFill>
-                    <a:blip r:embed="rId32"/>
+                    <a:blip r:embed="rId33"/>
                     <a:stretch>
                       <a:fillRect/>
                     </a:stretch>
@@ -7023,18 +7027,18 @@
           <wp:inline>
             <wp:extent cx="5334000" cy="2141262"/>
             <wp:effectExtent b="0" l="0" r="0" t="0"/>
-            <wp:docPr descr="Amostras" title="" id="36" name="Picture"/>
+            <wp:docPr descr="Amostras" title="" id="37" name="Picture"/>
             <a:graphic>
               <a:graphicData uri="http://schemas.openxmlformats.org/drawingml/2006/picture">
                 <pic:pic>
                   <pic:nvPicPr>
-                    <pic:cNvPr descr="figuras/cast_amostras.png" id="37" name="Picture"/>
+                    <pic:cNvPr descr="figuras/cast_amostras.png" id="38" name="Picture"/>
                     <pic:cNvPicPr>
                       <a:picLocks noChangeArrowheads="1" noChangeAspect="1"/>
                     </pic:cNvPicPr>
                   </pic:nvPicPr>
                   <pic:blipFill>
-                    <a:blip r:embed="rId35"/>
+                    <a:blip r:embed="rId36"/>
                     <a:stretch>
                       <a:fillRect/>
                     </a:stretch>
@@ -7099,18 +7103,18 @@
           <wp:inline>
             <wp:extent cx="5334000" cy="1859310"/>
             <wp:effectExtent b="0" l="0" r="0" t="0"/>
-            <wp:docPr descr="Média e histograma" title="" id="39" name="Picture"/>
+            <wp:docPr descr="Média e histograma" title="" id="40" name="Picture"/>
             <a:graphic>
               <a:graphicData uri="http://schemas.openxmlformats.org/drawingml/2006/picture">
                 <pic:pic>
                   <pic:nvPicPr>
-                    <pic:cNvPr descr="figuras/cast_media_hist.png" id="40" name="Picture"/>
+                    <pic:cNvPr descr="figuras/cast_media_hist.png" id="41" name="Picture"/>
                     <pic:cNvPicPr>
                       <a:picLocks noChangeArrowheads="1" noChangeAspect="1"/>
                     </pic:cNvPicPr>
                   </pic:nvPicPr>
                   <pic:blipFill>
-                    <a:blip r:embed="rId38"/>
+                    <a:blip r:embed="rId39"/>
                     <a:stretch>
                       <a:fillRect/>
                     </a:stretch>
@@ -7169,8 +7173,8 @@
         <w:t xml:space="preserve">É preciso olhar padrões locais, o que motiva usar HOG nos clássicos e convoluções na CNN.</w:t>
       </w:r>
     </w:p>
-    <w:bookmarkEnd w:id="41"/>
-    <w:bookmarkStart w:id="48" w:name="pré-processamento"/>
+    <w:bookmarkEnd w:id="42"/>
+    <w:bookmarkStart w:id="49" w:name="pré-processamento"/>
     <w:p>
       <w:pPr>
         <w:pStyle w:val="Heading4"/>
@@ -7442,18 +7446,18 @@
           <wp:inline>
             <wp:extent cx="4380613" cy="2353339"/>
             <wp:effectExtent b="0" l="0" r="0" t="0"/>
-            <wp:docPr descr="HOG" title="" id="43" name="Picture"/>
+            <wp:docPr descr="HOG" title="" id="44" name="Picture"/>
             <a:graphic>
               <a:graphicData uri="http://schemas.openxmlformats.org/drawingml/2006/picture">
                 <pic:pic>
                   <pic:nvPicPr>
-                    <pic:cNvPr descr="figuras/cast_hog_exemplo.png" id="44" name="Picture"/>
+                    <pic:cNvPr descr="figuras/cast_hog_exemplo.png" id="45" name="Picture"/>
                     <pic:cNvPicPr>
                       <a:picLocks noChangeArrowheads="1" noChangeAspect="1"/>
                     </pic:cNvPicPr>
                   </pic:nvPicPr>
                   <pic:blipFill>
-                    <a:blip r:embed="rId42"/>
+                    <a:blip r:embed="rId43"/>
                     <a:stretch>
                       <a:fillRect/>
                     </a:stretch>
@@ -7719,18 +7723,18 @@
           <wp:inline>
             <wp:extent cx="4458586" cy="2835348"/>
             <wp:effectExtent b="0" l="0" r="0" t="0"/>
-            <wp:docPr descr="PCA" title="" id="46" name="Picture"/>
+            <wp:docPr descr="PCA" title="" id="47" name="Picture"/>
             <a:graphic>
               <a:graphicData uri="http://schemas.openxmlformats.org/drawingml/2006/picture">
                 <pic:pic>
                   <pic:nvPicPr>
-                    <pic:cNvPr descr="figuras/cast_pca.png" id="47" name="Picture"/>
+                    <pic:cNvPr descr="figuras/cast_pca.png" id="48" name="Picture"/>
                     <pic:cNvPicPr>
                       <a:picLocks noChangeArrowheads="1" noChangeAspect="1"/>
                     </pic:cNvPicPr>
                   </pic:nvPicPr>
                   <pic:blipFill>
-                    <a:blip r:embed="rId45"/>
+                    <a:blip r:embed="rId46"/>
                     <a:stretch>
                       <a:fillRect/>
                     </a:stretch>
@@ -7765,8 +7769,8 @@
         <w:t xml:space="preserve">PCA</w:t>
       </w:r>
     </w:p>
-    <w:bookmarkEnd w:id="48"/>
-    <w:bookmarkStart w:id="52" w:name="hiperparametrização-gridsearch-optuna"/>
+    <w:bookmarkEnd w:id="49"/>
+    <w:bookmarkStart w:id="53" w:name="hiperparametrização-gridsearch-optuna"/>
     <w:p>
       <w:pPr>
         <w:pStyle w:val="Heading4"/>
@@ -8341,18 +8345,18 @@
           <wp:inline>
             <wp:extent cx="5334000" cy="1701541"/>
             <wp:effectExtent b="0" l="0" r="0" t="0"/>
-            <wp:docPr descr="GS vs Optuna" title="" id="50" name="Picture"/>
+            <wp:docPr descr="GS vs Optuna" title="" id="51" name="Picture"/>
             <a:graphic>
               <a:graphicData uri="http://schemas.openxmlformats.org/drawingml/2006/picture">
                 <pic:pic>
                   <pic:nvPicPr>
-                    <pic:cNvPr descr="figuras/cast_gs_vs_optuna.png" id="51" name="Picture"/>
+                    <pic:cNvPr descr="figuras/cast_gs_vs_optuna.png" id="52" name="Picture"/>
                     <pic:cNvPicPr>
                       <a:picLocks noChangeArrowheads="1" noChangeAspect="1"/>
                     </pic:cNvPicPr>
                   </pic:nvPicPr>
                   <pic:blipFill>
-                    <a:blip r:embed="rId49"/>
+                    <a:blip r:embed="rId50"/>
                     <a:stretch>
                       <a:fillRect/>
                     </a:stretch>
@@ -8545,8 +8549,8 @@
         <w:t xml:space="preserve">GridSearch e Optuna empataram (F1 de validação 0,999). Fica a rede mais simples (16 filtros, 81 mil parâmetros), com dropout de 0,5.</w:t>
       </w:r>
     </w:p>
-    <w:bookmarkEnd w:id="52"/>
-    <w:bookmarkStart w:id="59" w:name="resultados-no-teste-715-imagens"/>
+    <w:bookmarkEnd w:id="53"/>
+    <w:bookmarkStart w:id="60" w:name="resultados-no-teste-715-imagens"/>
     <w:p>
       <w:pPr>
         <w:pStyle w:val="Heading4"/>
@@ -9121,18 +9125,18 @@
           <wp:inline>
             <wp:extent cx="5334000" cy="3114721"/>
             <wp:effectExtent b="0" l="0" r="0" t="0"/>
-            <wp:docPr descr="Matrizes de confusão" title="" id="54" name="Picture"/>
+            <wp:docPr descr="Matrizes de confusão" title="" id="55" name="Picture"/>
             <a:graphic>
               <a:graphicData uri="http://schemas.openxmlformats.org/drawingml/2006/picture">
                 <pic:pic>
                   <pic:nvPicPr>
-                    <pic:cNvPr descr="figuras/cast_confusao.png" id="55" name="Picture"/>
+                    <pic:cNvPr descr="figuras/cast_confusao.png" id="56" name="Picture"/>
                     <pic:cNvPicPr>
                       <a:picLocks noChangeArrowheads="1" noChangeAspect="1"/>
                     </pic:cNvPicPr>
                   </pic:nvPicPr>
                   <pic:blipFill>
-                    <a:blip r:embed="rId53"/>
+                    <a:blip r:embed="rId54"/>
                     <a:stretch>
                       <a:fillRect/>
                     </a:stretch>
@@ -9176,18 +9180,18 @@
           <wp:inline>
             <wp:extent cx="5334000" cy="1817886"/>
             <wp:effectExtent b="0" l="0" r="0" t="0"/>
-            <wp:docPr descr="Curvas CNN" title="" id="57" name="Picture"/>
+            <wp:docPr descr="Curvas CNN" title="" id="58" name="Picture"/>
             <a:graphic>
               <a:graphicData uri="http://schemas.openxmlformats.org/drawingml/2006/picture">
                 <pic:pic>
                   <pic:nvPicPr>
-                    <pic:cNvPr descr="figuras/cast_cnn_curvas.png" id="58" name="Picture"/>
+                    <pic:cNvPr descr="figuras/cast_cnn_curvas.png" id="59" name="Picture"/>
                     <pic:cNvPicPr>
                       <a:picLocks noChangeArrowheads="1" noChangeAspect="1"/>
                     </pic:cNvPicPr>
                   </pic:nvPicPr>
                   <pic:blipFill>
-                    <a:blip r:embed="rId56"/>
+                    <a:blip r:embed="rId57"/>
                     <a:stretch>
                       <a:fillRect/>
                     </a:stretch>
@@ -9222,8 +9226,8 @@
         <w:t xml:space="preserve">Curvas CNN</w:t>
       </w:r>
     </w:p>
-    <w:bookmarkEnd w:id="59"/>
-    <w:bookmarkStart w:id="63" w:name="X03f6d90d9eecc5ad792905c8ab1d50b07a83377"/>
+    <w:bookmarkEnd w:id="60"/>
+    <w:bookmarkStart w:id="64" w:name="X03f6d90d9eecc5ad792905c8ab1d50b07a83377"/>
     <w:p>
       <w:pPr>
         <w:pStyle w:val="Heading4"/>
@@ -9733,18 +9737,18 @@
           <wp:inline>
             <wp:extent cx="5103627" cy="1970567"/>
             <wp:effectExtent b="0" l="0" r="0" t="0"/>
-            <wp:docPr descr="Erros da CNN" title="" id="61" name="Picture"/>
+            <wp:docPr descr="Erros da CNN" title="" id="62" name="Picture"/>
             <a:graphic>
               <a:graphicData uri="http://schemas.openxmlformats.org/drawingml/2006/picture">
                 <pic:pic>
                   <pic:nvPicPr>
-                    <pic:cNvPr descr="figuras/cast_cnn_erros.png" id="62" name="Picture"/>
+                    <pic:cNvPr descr="figuras/cast_cnn_erros.png" id="63" name="Picture"/>
                     <pic:cNvPicPr>
                       <a:picLocks noChangeArrowheads="1" noChangeAspect="1"/>
                     </pic:cNvPicPr>
                   </pic:nvPicPr>
                   <pic:blipFill>
-                    <a:blip r:embed="rId60"/>
+                    <a:blip r:embed="rId61"/>
                     <a:stretch>
                       <a:fillRect/>
                     </a:stretch>
@@ -9794,9 +9798,9 @@
         </w:pict>
       </w:r>
     </w:p>
-    <w:bookmarkEnd w:id="63"/>
     <w:bookmarkEnd w:id="64"/>
-    <w:bookmarkStart w:id="94" w:name="dataset-3-neu-surface-defect-database"/>
+    <w:bookmarkEnd w:id="65"/>
+    <w:bookmarkStart w:id="95" w:name="dataset-3-neu-surface-defect-database"/>
     <w:p>
       <w:pPr>
         <w:pStyle w:val="Heading3"/>
@@ -9805,7 +9809,7 @@
         <w:t xml:space="preserve">3.3 Dataset 3: NEU Surface Defect Database</w:t>
       </w:r>
     </w:p>
-    <w:bookmarkStart w:id="71" w:name="análise-exploratória-1"/>
+    <w:bookmarkStart w:id="72" w:name="análise-exploratória-1"/>
     <w:p>
       <w:pPr>
         <w:pStyle w:val="Heading4"/>
@@ -9863,18 +9867,18 @@
           <wp:inline>
             <wp:extent cx="5334000" cy="6551497"/>
             <wp:effectExtent b="0" l="0" r="0" t="0"/>
-            <wp:docPr descr="Amostras NEU" title="" id="66" name="Picture"/>
+            <wp:docPr descr="Amostras NEU" title="" id="67" name="Picture"/>
             <a:graphic>
               <a:graphicData uri="http://schemas.openxmlformats.org/drawingml/2006/picture">
                 <pic:pic>
                   <pic:nvPicPr>
-                    <pic:cNvPr descr="figuras/neu_amostras.png" id="67" name="Picture"/>
+                    <pic:cNvPr descr="figuras/neu_amostras.png" id="68" name="Picture"/>
                     <pic:cNvPicPr>
                       <a:picLocks noChangeArrowheads="1" noChangeAspect="1"/>
                     </pic:cNvPicPr>
                   </pic:nvPicPr>
                   <pic:blipFill>
-                    <a:blip r:embed="rId65"/>
+                    <a:blip r:embed="rId66"/>
                     <a:stretch>
                       <a:fillRect/>
                     </a:stretch>
@@ -10035,18 +10039,18 @@
           <wp:inline>
             <wp:extent cx="5334000" cy="785894"/>
             <wp:effectExtent b="0" l="0" r="0" t="0"/>
-            <wp:docPr descr="Média e histograma NEU" title="" id="69" name="Picture"/>
+            <wp:docPr descr="Média e histograma NEU" title="" id="70" name="Picture"/>
             <a:graphic>
               <a:graphicData uri="http://schemas.openxmlformats.org/drawingml/2006/picture">
                 <pic:pic>
                   <pic:nvPicPr>
-                    <pic:cNvPr descr="figuras/neu_media_hist.png" id="70" name="Picture"/>
+                    <pic:cNvPr descr="figuras/neu_media_hist.png" id="71" name="Picture"/>
                     <pic:cNvPicPr>
                       <a:picLocks noChangeArrowheads="1" noChangeAspect="1"/>
                     </pic:cNvPicPr>
                   </pic:nvPicPr>
                   <pic:blipFill>
-                    <a:blip r:embed="rId68"/>
+                    <a:blip r:embed="rId69"/>
                     <a:stretch>
                       <a:fillRect/>
                     </a:stretch>
@@ -10118,8 +10122,8 @@
         <w:t xml:space="preserve">), mas os histogramas se sobrepõem muito. A informação que separa as classes está na textura.</w:t>
       </w:r>
     </w:p>
-    <w:bookmarkEnd w:id="71"/>
-    <w:bookmarkStart w:id="75" w:name="Xe2eb975a6ee1c0ad8f26318605db04eae1dde61"/>
+    <w:bookmarkEnd w:id="72"/>
+    <w:bookmarkStart w:id="76" w:name="Xe2eb975a6ee1c0ad8f26318605db04eae1dde61"/>
     <w:p>
       <w:pPr>
         <w:pStyle w:val="Heading4"/>
@@ -10579,18 +10583,18 @@
           <wp:inline>
             <wp:extent cx="4458586" cy="2835348"/>
             <wp:effectExtent b="0" l="0" r="0" t="0"/>
-            <wp:docPr descr="PCA NEU" title="" id="73" name="Picture"/>
+            <wp:docPr descr="PCA NEU" title="" id="74" name="Picture"/>
             <a:graphic>
               <a:graphicData uri="http://schemas.openxmlformats.org/drawingml/2006/picture">
                 <pic:pic>
                   <pic:nvPicPr>
-                    <pic:cNvPr descr="figuras/neu_pca.png" id="74" name="Picture"/>
+                    <pic:cNvPr descr="figuras/neu_pca.png" id="75" name="Picture"/>
                     <pic:cNvPicPr>
                       <a:picLocks noChangeArrowheads="1" noChangeAspect="1"/>
                     </pic:cNvPicPr>
                   </pic:nvPicPr>
                   <pic:blipFill>
-                    <a:blip r:embed="rId72"/>
+                    <a:blip r:embed="rId73"/>
                     <a:stretch>
                       <a:fillRect/>
                     </a:stretch>
@@ -10625,8 +10629,8 @@
         <w:t xml:space="preserve">PCA NEU</w:t>
       </w:r>
     </w:p>
-    <w:bookmarkEnd w:id="75"/>
-    <w:bookmarkStart w:id="79" w:name="hiperparametrização"/>
+    <w:bookmarkEnd w:id="76"/>
+    <w:bookmarkStart w:id="80" w:name="hiperparametrização"/>
     <w:p>
       <w:pPr>
         <w:pStyle w:val="Heading4"/>
@@ -11035,18 +11039,18 @@
           <wp:inline>
             <wp:extent cx="5334000" cy="1701541"/>
             <wp:effectExtent b="0" l="0" r="0" t="0"/>
-            <wp:docPr descr="GS vs Optuna NEU" title="" id="77" name="Picture"/>
+            <wp:docPr descr="GS vs Optuna NEU" title="" id="78" name="Picture"/>
             <a:graphic>
               <a:graphicData uri="http://schemas.openxmlformats.org/drawingml/2006/picture">
                 <pic:pic>
                   <pic:nvPicPr>
-                    <pic:cNvPr descr="figuras/neu_gs_vs_optuna.png" id="78" name="Picture"/>
+                    <pic:cNvPr descr="figuras/neu_gs_vs_optuna.png" id="79" name="Picture"/>
                     <pic:cNvPicPr>
                       <a:picLocks noChangeArrowheads="1" noChangeAspect="1"/>
                     </pic:cNvPicPr>
                   </pic:nvPicPr>
                   <pic:blipFill>
-                    <a:blip r:embed="rId76"/>
+                    <a:blip r:embed="rId77"/>
                     <a:stretch>
                       <a:fillRect/>
                     </a:stretch>
@@ -11196,8 +11200,8 @@
         <w:t xml:space="preserve">precisou de mais filtros que no Casting (32 contra 16; 305 mil parâmetros). Texturas exigem mais detectores diferentes do que a silhueta de uma peça.</w:t>
       </w:r>
     </w:p>
-    <w:bookmarkEnd w:id="79"/>
-    <w:bookmarkStart w:id="86" w:name="resultados-no-teste-270-imagens"/>
+    <w:bookmarkEnd w:id="80"/>
+    <w:bookmarkStart w:id="87" w:name="resultados-no-teste-270-imagens"/>
     <w:p>
       <w:pPr>
         <w:pStyle w:val="Heading4"/>
@@ -11772,18 +11776,18 @@
           <wp:inline>
             <wp:extent cx="5334000" cy="3118487"/>
             <wp:effectExtent b="0" l="0" r="0" t="0"/>
-            <wp:docPr descr="Matrizes NEU" title="" id="81" name="Picture"/>
+            <wp:docPr descr="Matrizes NEU" title="" id="82" name="Picture"/>
             <a:graphic>
               <a:graphicData uri="http://schemas.openxmlformats.org/drawingml/2006/picture">
                 <pic:pic>
                   <pic:nvPicPr>
-                    <pic:cNvPr descr="figuras/neu_confusao.png" id="82" name="Picture"/>
+                    <pic:cNvPr descr="figuras/neu_confusao.png" id="83" name="Picture"/>
                     <pic:cNvPicPr>
                       <a:picLocks noChangeArrowheads="1" noChangeAspect="1"/>
                     </pic:cNvPicPr>
                   </pic:nvPicPr>
                   <pic:blipFill>
-                    <a:blip r:embed="rId80"/>
+                    <a:blip r:embed="rId81"/>
                     <a:stretch>
                       <a:fillRect/>
                     </a:stretch>
@@ -11827,18 +11831,18 @@
           <wp:inline>
             <wp:extent cx="5334000" cy="1864539"/>
             <wp:effectExtent b="0" l="0" r="0" t="0"/>
-            <wp:docPr descr="Curvas CNN NEU" title="" id="84" name="Picture"/>
+            <wp:docPr descr="Curvas CNN NEU" title="" id="85" name="Picture"/>
             <a:graphic>
               <a:graphicData uri="http://schemas.openxmlformats.org/drawingml/2006/picture">
                 <pic:pic>
                   <pic:nvPicPr>
-                    <pic:cNvPr descr="figuras/neu_cnn_curvas.png" id="85" name="Picture"/>
+                    <pic:cNvPr descr="figuras/neu_cnn_curvas.png" id="86" name="Picture"/>
                     <pic:cNvPicPr>
                       <a:picLocks noChangeArrowheads="1" noChangeAspect="1"/>
                     </pic:cNvPicPr>
                   </pic:nvPicPr>
                   <pic:blipFill>
-                    <a:blip r:embed="rId83"/>
+                    <a:blip r:embed="rId84"/>
                     <a:stretch>
                       <a:fillRect/>
                     </a:stretch>
@@ -11894,8 +11898,8 @@
         <w:t xml:space="preserve">.</w:t>
       </w:r>
     </w:p>
-    <w:bookmarkEnd w:id="86"/>
-    <w:bookmarkStart w:id="93" w:name="f1-por-classe"/>
+    <w:bookmarkEnd w:id="87"/>
+    <w:bookmarkStart w:id="94" w:name="f1-por-classe"/>
     <w:p>
       <w:pPr>
         <w:pStyle w:val="Heading4"/>
@@ -12559,18 +12563,18 @@
           <wp:inline>
             <wp:extent cx="5334000" cy="2531101"/>
             <wp:effectExtent b="0" l="0" r="0" t="0"/>
-            <wp:docPr descr="F1 por classe" title="" id="88" name="Picture"/>
+            <wp:docPr descr="F1 por classe" title="" id="89" name="Picture"/>
             <a:graphic>
               <a:graphicData uri="http://schemas.openxmlformats.org/drawingml/2006/picture">
                 <pic:pic>
                   <pic:nvPicPr>
-                    <pic:cNvPr descr="figuras/neu_f1_por_classe.png" id="89" name="Picture"/>
+                    <pic:cNvPr descr="figuras/neu_f1_por_classe.png" id="90" name="Picture"/>
                     <pic:cNvPicPr>
                       <a:picLocks noChangeArrowheads="1" noChangeAspect="1"/>
                     </pic:cNvPicPr>
                   </pic:nvPicPr>
                   <pic:blipFill>
-                    <a:blip r:embed="rId87"/>
+                    <a:blip r:embed="rId88"/>
                     <a:stretch>
                       <a:fillRect/>
                     </a:stretch>
@@ -12849,18 +12853,18 @@
           <wp:inline>
             <wp:extent cx="3352800" cy="1942213"/>
             <wp:effectExtent b="0" l="0" r="0" t="0"/>
-            <wp:docPr descr="Erros CNN NEU" title="" id="91" name="Picture"/>
+            <wp:docPr descr="Erros CNN NEU" title="" id="92" name="Picture"/>
             <a:graphic>
               <a:graphicData uri="http://schemas.openxmlformats.org/drawingml/2006/picture">
                 <pic:pic>
                   <pic:nvPicPr>
-                    <pic:cNvPr descr="figuras/neu_cnn_erros.png" id="92" name="Picture"/>
+                    <pic:cNvPr descr="figuras/neu_cnn_erros.png" id="93" name="Picture"/>
                     <pic:cNvPicPr>
                       <a:picLocks noChangeArrowheads="1" noChangeAspect="1"/>
                     </pic:cNvPicPr>
                   </pic:nvPicPr>
                   <pic:blipFill>
-                    <a:blip r:embed="rId90"/>
+                    <a:blip r:embed="rId91"/>
                     <a:stretch>
                       <a:fillRect/>
                     </a:stretch>
@@ -12902,9 +12906,9 @@
         </w:pict>
       </w:r>
     </w:p>
-    <w:bookmarkEnd w:id="93"/>
     <w:bookmarkEnd w:id="94"/>
-    <w:bookmarkStart w:id="98" w:name="comparação-cruzada"/>
+    <w:bookmarkEnd w:id="95"/>
+    <w:bookmarkStart w:id="99" w:name="comparação-cruzada"/>
     <w:p>
       <w:pPr>
         <w:pStyle w:val="Heading3"/>
@@ -12922,18 +12926,18 @@
           <wp:inline>
             <wp:extent cx="5334000" cy="1692191"/>
             <wp:effectExtent b="0" l="0" r="0" t="0"/>
-            <wp:docPr descr="Comparação" title="" id="96" name="Picture"/>
+            <wp:docPr descr="Comparação" title="" id="97" name="Picture"/>
             <a:graphic>
               <a:graphicData uri="http://schemas.openxmlformats.org/drawingml/2006/picture">
                 <pic:pic>
                   <pic:nvPicPr>
-                    <pic:cNvPr descr="figuras/comparacao_cruzada.png" id="97" name="Picture"/>
+                    <pic:cNvPr descr="figuras/comparacao_cruzada.png" id="98" name="Picture"/>
                     <pic:cNvPicPr>
                       <a:picLocks noChangeArrowheads="1" noChangeAspect="1"/>
                     </pic:cNvPicPr>
                   </pic:nvPicPr>
                   <pic:blipFill>
-                    <a:blip r:embed="rId95"/>
+                    <a:blip r:embed="rId96"/>
                     <a:stretch>
                       <a:fillRect/>
                     </a:stretch>
@@ -13407,8 +13411,8 @@
         <w:t xml:space="preserve">Grades bem escolhidas e pequenas competem bem. O Optuna se destaca quando o espaço é grande ou contínuo.</w:t>
       </w:r>
     </w:p>
-    <w:bookmarkEnd w:id="98"/>
-    <w:bookmarkStart w:id="99" w:name="X3b42b21417debce7f18d52bba753c3df53b6ba8"/>
+    <w:bookmarkEnd w:id="99"/>
+    <w:bookmarkStart w:id="100" w:name="X3b42b21417debce7f18d52bba753c3df53b6ba8"/>
     <w:p>
       <w:pPr>
         <w:pStyle w:val="Heading3"/>
@@ -13493,15 +13497,19 @@
       <w:r>
         <w:t xml:space="preserve">, para ignorar o transiente inicial. Com isso, o F1 passou de 0,13 para 0,99.</w:t>
       </w:r>
-      <w:r>
-        <w:t xml:space="preserve"> </w:t>
-      </w:r>
-      <w:r>
-        <w:t xml:space="preserve">## 4. Parte 2: prognóstico de RUL com RNN (C-MAPSS FD001)</w:t>
-      </w:r>
-    </w:p>
-    <w:bookmarkEnd w:id="99"/>
-    <w:bookmarkStart w:id="100" w:name="o-problema"/>
+    </w:p>
+    <w:bookmarkEnd w:id="100"/>
+    <w:bookmarkEnd w:id="101"/>
+    <w:bookmarkStart w:id="145" w:name="Xbc1e8c329658429f49b009f1204ec8e42342327"/>
+    <w:p>
+      <w:pPr>
+        <w:pStyle w:val="Heading2"/>
+      </w:pPr>
+      <w:r>
+        <w:t xml:space="preserve">4. Parte 2: prognóstico de RUL com RNN (C-MAPSS FD001)</w:t>
+      </w:r>
+    </w:p>
+    <w:bookmarkStart w:id="102" w:name="o-problema"/>
     <w:p>
       <w:pPr>
         <w:pStyle w:val="Heading3"/>
@@ -13567,8 +13575,8 @@
         <w:t xml:space="preserve">informa o RUL verdadeiro. Há uma única condição de operação (cruzeiro) e um único modo de falha (degradação do compressor de alta pressão, HPC). Cada linha é um ciclo, com 3 condições operacionais e 21 sensores.</w:t>
       </w:r>
     </w:p>
-    <w:bookmarkEnd w:id="100"/>
-    <w:bookmarkStart w:id="110" w:name="análise-exploratória-2"/>
+    <w:bookmarkEnd w:id="102"/>
+    <w:bookmarkStart w:id="112" w:name="análise-exploratória-2"/>
     <w:p>
       <w:pPr>
         <w:pStyle w:val="Heading3"/>
@@ -13586,18 +13594,18 @@
           <wp:inline>
             <wp:extent cx="5334000" cy="1701541"/>
             <wp:effectExtent b="0" l="0" r="0" t="0"/>
-            <wp:docPr descr="Distribuição de ciclos por motor" title="" id="102" name="Picture"/>
+            <wp:docPr descr="Distribuição de ciclos por motor" title="" id="104" name="Picture"/>
             <a:graphic>
               <a:graphicData uri="http://schemas.openxmlformats.org/drawingml/2006/picture">
                 <pic:pic>
                   <pic:nvPicPr>
-                    <pic:cNvPr descr="figuras/rnn_ciclos_por_motor.png" id="103" name="Picture"/>
+                    <pic:cNvPr descr="figuras/rnn_ciclos_por_motor.png" id="105" name="Picture"/>
                     <pic:cNvPicPr>
                       <a:picLocks noChangeArrowheads="1" noChangeAspect="1"/>
                     </pic:cNvPicPr>
                   </pic:nvPicPr>
                   <pic:blipFill>
-                    <a:blip r:embed="rId101"/>
+                    <a:blip r:embed="rId103"/>
                     <a:stretch>
                       <a:fillRect/>
                     </a:stretch>
@@ -13665,18 +13673,18 @@
           <wp:inline>
             <wp:extent cx="5334000" cy="1303937"/>
             <wp:effectExtent b="0" l="0" r="0" t="0"/>
-            <wp:docPr descr="Séries de sensores" title="" id="105" name="Picture"/>
+            <wp:docPr descr="Séries de sensores" title="" id="107" name="Picture"/>
             <a:graphic>
               <a:graphicData uri="http://schemas.openxmlformats.org/drawingml/2006/picture">
                 <pic:pic>
                   <pic:nvPicPr>
-                    <pic:cNvPr descr="figuras/rnn_series_sensores.png" id="106" name="Picture"/>
+                    <pic:cNvPr descr="figuras/rnn_series_sensores.png" id="108" name="Picture"/>
                     <pic:cNvPicPr>
                       <a:picLocks noChangeArrowheads="1" noChangeAspect="1"/>
                     </pic:cNvPicPr>
                   </pic:nvPicPr>
                   <pic:blipFill>
-                    <a:blip r:embed="rId104"/>
+                    <a:blip r:embed="rId106"/>
                     <a:stretch>
                       <a:fillRect/>
                     </a:stretch>
@@ -13775,18 +13783,18 @@
           <wp:inline>
             <wp:extent cx="5334000" cy="4524738"/>
             <wp:effectExtent b="0" l="0" r="0" t="0"/>
-            <wp:docPr descr="Correlação" title="" id="108" name="Picture"/>
+            <wp:docPr descr="Correlação" title="" id="110" name="Picture"/>
             <a:graphic>
               <a:graphicData uri="http://schemas.openxmlformats.org/drawingml/2006/picture">
                 <pic:pic>
                   <pic:nvPicPr>
-                    <pic:cNvPr descr="figuras/rnn_correlacao.png" id="109" name="Picture"/>
+                    <pic:cNvPr descr="figuras/rnn_correlacao.png" id="111" name="Picture"/>
                     <pic:cNvPicPr>
                       <a:picLocks noChangeArrowheads="1" noChangeAspect="1"/>
                     </pic:cNvPicPr>
                   </pic:nvPicPr>
                   <pic:blipFill>
-                    <a:blip r:embed="rId107"/>
+                    <a:blip r:embed="rId109"/>
                     <a:stretch>
                       <a:fillRect/>
                     </a:stretch>
@@ -13874,8 +13882,8 @@
         <w:t xml:space="preserve">) têm correlação de 0,96 entre si. A redundância é alta, mas a RNN combina essas medidas ruidosas, o que funciona como uma média que reduz o ruído.</w:t>
       </w:r>
     </w:p>
-    <w:bookmarkEnd w:id="110"/>
-    <w:bookmarkStart w:id="114" w:name="pré-processamento-e-por-que-cada-passo"/>
+    <w:bookmarkEnd w:id="112"/>
+    <w:bookmarkStart w:id="116" w:name="pré-processamento-e-por-que-cada-passo"/>
     <w:p>
       <w:pPr>
         <w:pStyle w:val="Heading3"/>
@@ -14374,18 +14382,18 @@
           <wp:inline>
             <wp:extent cx="5334000" cy="2596630"/>
             <wp:effectExtent b="0" l="0" r="0" t="0"/>
-            <wp:docPr descr="Alvo clipado" title="" id="112" name="Picture"/>
+            <wp:docPr descr="Alvo clipado" title="" id="114" name="Picture"/>
             <a:graphic>
               <a:graphicData uri="http://schemas.openxmlformats.org/drawingml/2006/picture">
                 <pic:pic>
                   <pic:nvPicPr>
-                    <pic:cNvPr descr="figuras/rnn_rul_clip.png" id="113" name="Picture"/>
+                    <pic:cNvPr descr="figuras/rnn_rul_clip.png" id="115" name="Picture"/>
                     <pic:cNvPicPr>
                       <a:picLocks noChangeArrowheads="1" noChangeAspect="1"/>
                     </pic:cNvPicPr>
                   </pic:nvPicPr>
                   <pic:blipFill>
-                    <a:blip r:embed="rId111"/>
+                    <a:blip r:embed="rId113"/>
                     <a:stretch>
                       <a:fillRect/>
                     </a:stretch>
@@ -14454,8 +14462,8 @@
         <w:t xml:space="preserve">nos motores de teste curtos (0 motores com W = 30, 4 com W = 40 e 7 com W = 50). Por isso W entrou no espaço de busca do Optuna.</w:t>
       </w:r>
     </w:p>
-    <w:bookmarkEnd w:id="114"/>
-    <w:bookmarkStart w:id="118" w:name="arquitetura-de-partida-e-treinamento"/>
+    <w:bookmarkEnd w:id="116"/>
+    <w:bookmarkStart w:id="120" w:name="arquitetura-de-partida-e-treinamento"/>
     <w:p>
       <w:pPr>
         <w:pStyle w:val="Heading3"/>
@@ -14644,18 +14652,18 @@
           <wp:inline>
             <wp:extent cx="5334000" cy="2775928"/>
             <wp:effectExtent b="0" l="0" r="0" t="0"/>
-            <wp:docPr descr="Loss baseline" title="" id="116" name="Picture"/>
+            <wp:docPr descr="Loss baseline" title="" id="118" name="Picture"/>
             <a:graphic>
               <a:graphicData uri="http://schemas.openxmlformats.org/drawingml/2006/picture">
                 <pic:pic>
                   <pic:nvPicPr>
-                    <pic:cNvPr descr="figuras/rnn_loss_baseline.png" id="117" name="Picture"/>
+                    <pic:cNvPr descr="figuras/rnn_loss_baseline.png" id="119" name="Picture"/>
                     <pic:cNvPicPr>
                       <a:picLocks noChangeArrowheads="1" noChangeAspect="1"/>
                     </pic:cNvPicPr>
                   </pic:nvPicPr>
                   <pic:blipFill>
-                    <a:blip r:embed="rId115"/>
+                    <a:blip r:embed="rId117"/>
                     <a:stretch>
                       <a:fillRect/>
                     </a:stretch>
@@ -14986,8 +14994,8 @@
         <w:t xml:space="preserve">Com janelas de 30 passos as três células ficam próximas. Mesmo assim, a GRU foi a melhor, convergiu na metade das épocas e tem menos parâmetros que a LSTM.</w:t>
       </w:r>
     </w:p>
-    <w:bookmarkEnd w:id="118"/>
-    <w:bookmarkStart w:id="131" w:name="optuna-tpe-hyperband"/>
+    <w:bookmarkEnd w:id="120"/>
+    <w:bookmarkStart w:id="133" w:name="optuna-tpe-hyperband"/>
     <w:p>
       <w:pPr>
         <w:pStyle w:val="Heading3"/>
@@ -15410,18 +15418,18 @@
           <wp:inline>
             <wp:extent cx="5334000" cy="3834204"/>
             <wp:effectExtent b="0" l="0" r="0" t="0"/>
-            <wp:docPr descr="Importância" title="" id="120" name="Picture"/>
+            <wp:docPr descr="Importância" title="" id="122" name="Picture"/>
             <a:graphic>
               <a:graphicData uri="http://schemas.openxmlformats.org/drawingml/2006/picture">
                 <pic:pic>
                   <pic:nvPicPr>
-                    <pic:cNvPr descr="figuras/rnn_optuna_importancia.png" id="121" name="Picture"/>
+                    <pic:cNvPr descr="figuras/rnn_optuna_importancia.png" id="123" name="Picture"/>
                     <pic:cNvPicPr>
                       <a:picLocks noChangeArrowheads="1" noChangeAspect="1"/>
                     </pic:cNvPicPr>
                   </pic:nvPicPr>
                   <pic:blipFill>
-                    <a:blip r:embed="rId119"/>
+                    <a:blip r:embed="rId121"/>
                     <a:stretch>
                       <a:fillRect/>
                     </a:stretch>
@@ -15465,18 +15473,18 @@
           <wp:inline>
             <wp:extent cx="5334000" cy="4021928"/>
             <wp:effectExtent b="0" l="0" r="0" t="0"/>
-            <wp:docPr descr="Histórico" title="" id="123" name="Picture"/>
+            <wp:docPr descr="Histórico" title="" id="125" name="Picture"/>
             <a:graphic>
               <a:graphicData uri="http://schemas.openxmlformats.org/drawingml/2006/picture">
                 <pic:pic>
                   <pic:nvPicPr>
-                    <pic:cNvPr descr="figuras/rnn_optuna_historico.png" id="124" name="Picture"/>
+                    <pic:cNvPr descr="figuras/rnn_optuna_historico.png" id="126" name="Picture"/>
                     <pic:cNvPicPr>
                       <a:picLocks noChangeArrowheads="1" noChangeAspect="1"/>
                     </pic:cNvPicPr>
                   </pic:nvPicPr>
                   <pic:blipFill>
-                    <a:blip r:embed="rId122"/>
+                    <a:blip r:embed="rId124"/>
                     <a:stretch>
                       <a:fillRect/>
                     </a:stretch>
@@ -15520,18 +15528,18 @@
           <wp:inline>
             <wp:extent cx="5334000" cy="1725461"/>
             <wp:effectExtent b="0" l="0" r="0" t="0"/>
-            <wp:docPr descr="W e célula" title="" id="126" name="Picture"/>
+            <wp:docPr descr="W e célula" title="" id="128" name="Picture"/>
             <a:graphic>
               <a:graphicData uri="http://schemas.openxmlformats.org/drawingml/2006/picture">
                 <pic:pic>
                   <pic:nvPicPr>
-                    <pic:cNvPr descr="figuras/rnn_optuna_W_celula.png" id="127" name="Picture"/>
+                    <pic:cNvPr descr="figuras/rnn_optuna_W_celula.png" id="129" name="Picture"/>
                     <pic:cNvPicPr>
                       <a:picLocks noChangeArrowheads="1" noChangeAspect="1"/>
                     </pic:cNvPicPr>
                   </pic:nvPicPr>
                   <pic:blipFill>
-                    <a:blip r:embed="rId125"/>
+                    <a:blip r:embed="rId127"/>
                     <a:stretch>
                       <a:fillRect/>
                     </a:stretch>
@@ -15688,18 +15696,18 @@
           <wp:inline>
             <wp:extent cx="5334000" cy="2703901"/>
             <wp:effectExtent b="0" l="0" r="0" t="0"/>
-            <wp:docPr descr="Loss melhor modelo" title="" id="129" name="Picture"/>
+            <wp:docPr descr="Loss melhor modelo" title="" id="131" name="Picture"/>
             <a:graphic>
               <a:graphicData uri="http://schemas.openxmlformats.org/drawingml/2006/picture">
                 <pic:pic>
                   <pic:nvPicPr>
-                    <pic:cNvPr descr="figuras/rnn_loss_best.png" id="130" name="Picture"/>
+                    <pic:cNvPr descr="figuras/rnn_loss_best.png" id="132" name="Picture"/>
                     <pic:cNvPicPr>
                       <a:picLocks noChangeArrowheads="1" noChangeAspect="1"/>
                     </pic:cNvPicPr>
                   </pic:nvPicPr>
                   <pic:blipFill>
-                    <a:blip r:embed="rId128"/>
+                    <a:blip r:embed="rId130"/>
                     <a:stretch>
                       <a:fillRect/>
                     </a:stretch>
@@ -15766,8 +15774,8 @@
         <w:t xml:space="preserve">.</w:t>
       </w:r>
     </w:p>
-    <w:bookmarkEnd w:id="131"/>
-    <w:bookmarkStart w:id="138" w:name="resultados-no-teste-completo-100-motores"/>
+    <w:bookmarkEnd w:id="133"/>
+    <w:bookmarkStart w:id="140" w:name="resultados-no-teste-completo-100-motores"/>
     <w:p>
       <w:pPr>
         <w:pStyle w:val="Heading3"/>
@@ -16007,18 +16015,18 @@
           <wp:inline>
             <wp:extent cx="5334000" cy="1887223"/>
             <wp:effectExtent b="0" l="0" r="0" t="0"/>
-            <wp:docPr descr="Real vs previsto" title="" id="133" name="Picture"/>
+            <wp:docPr descr="Real vs previsto" title="" id="135" name="Picture"/>
             <a:graphic>
               <a:graphicData uri="http://schemas.openxmlformats.org/drawingml/2006/picture">
                 <pic:pic>
                   <pic:nvPicPr>
-                    <pic:cNvPr descr="figuras/rnn_real_vs_previsto.png" id="134" name="Picture"/>
+                    <pic:cNvPr descr="figuras/rnn_real_vs_previsto.png" id="136" name="Picture"/>
                     <pic:cNvPicPr>
                       <a:picLocks noChangeArrowheads="1" noChangeAspect="1"/>
                     </pic:cNvPicPr>
                   </pic:nvPicPr>
                   <pic:blipFill>
-                    <a:blip r:embed="rId132"/>
+                    <a:blip r:embed="rId134"/>
                     <a:stretch>
                       <a:fillRect/>
                     </a:stretch>
@@ -16062,18 +16070,18 @@
           <wp:inline>
             <wp:extent cx="4139609" cy="3962400"/>
             <wp:effectExtent b="0" l="0" r="0" t="0"/>
-            <wp:docPr descr="Scatter" title="" id="136" name="Picture"/>
+            <wp:docPr descr="Scatter" title="" id="138" name="Picture"/>
             <a:graphic>
               <a:graphicData uri="http://schemas.openxmlformats.org/drawingml/2006/picture">
                 <pic:pic>
                   <pic:nvPicPr>
-                    <pic:cNvPr descr="figuras/rnn_scatter.png" id="137" name="Picture"/>
+                    <pic:cNvPr descr="figuras/rnn_scatter.png" id="139" name="Picture"/>
                     <pic:cNvPicPr>
                       <a:picLocks noChangeArrowheads="1" noChangeAspect="1"/>
                     </pic:cNvPicPr>
                   </pic:nvPicPr>
                   <pic:blipFill>
-                    <a:blip r:embed="rId135"/>
+                    <a:blip r:embed="rId137"/>
                     <a:stretch>
                       <a:fillRect/>
                     </a:stretch>
@@ -16108,8 +16116,8 @@
         <w:t xml:space="preserve">Scatter</w:t>
       </w:r>
     </w:p>
-    <w:bookmarkEnd w:id="138"/>
-    <w:bookmarkStart w:id="142" w:name="quando-o-modelo-erra-mais"/>
+    <w:bookmarkEnd w:id="140"/>
+    <w:bookmarkStart w:id="144" w:name="quando-o-modelo-erra-mais"/>
     <w:p>
       <w:pPr>
         <w:pStyle w:val="Heading3"/>
@@ -16127,18 +16135,18 @@
           <wp:inline>
             <wp:extent cx="5334000" cy="1299066"/>
             <wp:effectExtent b="0" l="0" r="0" t="0"/>
-            <wp:docPr descr="Análise de erros" title="" id="140" name="Picture"/>
+            <wp:docPr descr="Análise de erros" title="" id="142" name="Picture"/>
             <a:graphic>
               <a:graphicData uri="http://schemas.openxmlformats.org/drawingml/2006/picture">
                 <pic:pic>
                   <pic:nvPicPr>
-                    <pic:cNvPr descr="figuras/rnn_analise_erros.png" id="141" name="Picture"/>
+                    <pic:cNvPr descr="figuras/rnn_analise_erros.png" id="143" name="Picture"/>
                     <pic:cNvPicPr>
                       <a:picLocks noChangeArrowheads="1" noChangeAspect="1"/>
                     </pic:cNvPicPr>
                   </pic:nvPicPr>
                   <pic:blipFill>
-                    <a:blip r:embed="rId139"/>
+                    <a:blip r:embed="rId141"/>
                     <a:stretch>
                       <a:fillRect/>
                     </a:stretch>
@@ -16654,11 +16662,16 @@
       <w:r>
         <w:t xml:space="preserve">Os erros são aproximadamente simétricos (52% das previsões atrasadas). Em uso real, seria possível deslocar as previsões alguns ciclos para baixo, trocando um pouco de RMSE por mais segurança.</w:t>
       </w:r>
-      <w:r>
-        <w:t xml:space="preserve"> </w:t>
-      </w:r>
-      <w:r>
-        <w:t xml:space="preserve">## 5. Conclusões</w:t>
+    </w:p>
+    <w:bookmarkEnd w:id="144"/>
+    <w:bookmarkEnd w:id="145"/>
+    <w:bookmarkStart w:id="146" w:name="conclusões"/>
+    <w:p>
+      <w:pPr>
+        <w:pStyle w:val="Heading2"/>
+      </w:pPr>
+      <w:r>
+        <w:t xml:space="preserve">5. Conclusões</w:t>
       </w:r>
     </w:p>
     <w:p>
@@ -16815,9 +16828,8 @@
         <w:t xml:space="preserve">em treino e teste. No FD001, a validação usou apenas 20 motores.</w:t>
       </w:r>
     </w:p>
-    <w:bookmarkEnd w:id="142"/>
-    <w:bookmarkEnd w:id="143"/>
-    <w:bookmarkStart w:id="144" w:name="referências"/>
+    <w:bookmarkEnd w:id="146"/>
+    <w:bookmarkStart w:id="147" w:name="referências"/>
     <w:p>
       <w:pPr>
         <w:pStyle w:val="Heading2"/>
@@ -17079,8 +17091,8 @@
         <w:t xml:space="preserve">. JMLR.</w:t>
       </w:r>
     </w:p>
-    <w:bookmarkEnd w:id="144"/>
-    <w:bookmarkEnd w:id="145"/>
+    <w:bookmarkEnd w:id="147"/>
+    <w:bookmarkEnd w:id="148"/>
     <w:sectPr/>
   </w:body>
 </w:document>

</xml_diff>